<commit_message>
2021 as date change
</commit_message>
<xml_diff>
--- a/analysis/analysis/output/analysis_results.docx
+++ b/analysis/analysis/output/analysis_results.docx
@@ -536,15 +536,15 @@
         <w:tblLook w:firstRow="1" w:lastRow="0" w:firstColumn="0" w:lastColumn="0" w:noHBand="0" w:noVBand="0" w:val="0020"/>
       </w:tblPr>
       <w:tblGrid>
-        <w:gridCol w:w="1624"/>
-        <w:gridCol w:w="913"/>
-        <w:gridCol w:w="913"/>
-        <w:gridCol w:w="913"/>
-        <w:gridCol w:w="710"/>
-        <w:gridCol w:w="710"/>
-        <w:gridCol w:w="710"/>
-        <w:gridCol w:w="710"/>
-        <w:gridCol w:w="710"/>
+        <w:gridCol w:w="1604"/>
+        <w:gridCol w:w="902"/>
+        <w:gridCol w:w="902"/>
+        <w:gridCol w:w="1002"/>
+        <w:gridCol w:w="701"/>
+        <w:gridCol w:w="701"/>
+        <w:gridCol w:w="701"/>
+        <w:gridCol w:w="701"/>
+        <w:gridCol w:w="701"/>
       </w:tblGrid>
       <w:tr>
         <w:trPr>
@@ -668,43 +668,43 @@
               <w:jc w:val="left"/>
             </w:pPr>
             <w:r>
-              <w:t xml:space="preserve">2020 and After</w:t>
-            </w:r>
-          </w:p>
-        </w:tc>
-        <w:tc>
-          <w:tcPr/>
-          <w:p>
-            <w:pPr>
-              <w:pStyle w:val="Compact"/>
-              <w:jc w:val="right"/>
-            </w:pPr>
-            <w:r>
-              <w:t xml:space="preserve">2705</w:t>
-            </w:r>
-          </w:p>
-        </w:tc>
-        <w:tc>
-          <w:tcPr/>
-          <w:p>
-            <w:pPr>
-              <w:pStyle w:val="Compact"/>
-              <w:jc w:val="right"/>
-            </w:pPr>
-            <w:r>
-              <w:t xml:space="preserve">13.5331</w:t>
-            </w:r>
-          </w:p>
-        </w:tc>
-        <w:tc>
-          <w:tcPr/>
-          <w:p>
-            <w:pPr>
-              <w:pStyle w:val="Compact"/>
-              <w:jc w:val="right"/>
-            </w:pPr>
-            <w:r>
-              <w:t xml:space="preserve">200.352</w:t>
+              <w:t xml:space="preserve">2021 and After</w:t>
+            </w:r>
+          </w:p>
+        </w:tc>
+        <w:tc>
+          <w:tcPr/>
+          <w:p>
+            <w:pPr>
+              <w:pStyle w:val="Compact"/>
+              <w:jc w:val="right"/>
+            </w:pPr>
+            <w:r>
+              <w:t xml:space="preserve">2451</w:t>
+            </w:r>
+          </w:p>
+        </w:tc>
+        <w:tc>
+          <w:tcPr/>
+          <w:p>
+            <w:pPr>
+              <w:pStyle w:val="Compact"/>
+              <w:jc w:val="right"/>
+            </w:pPr>
+            <w:r>
+              <w:t xml:space="preserve">10.1816</w:t>
+            </w:r>
+          </w:p>
+        </w:tc>
+        <w:tc>
+          <w:tcPr/>
+          <w:p>
+            <w:pPr>
+              <w:pStyle w:val="Compact"/>
+              <w:jc w:val="right"/>
+            </w:pPr>
+            <w:r>
+              <w:t xml:space="preserve">96.0115</w:t>
             </w:r>
           </w:p>
         </w:tc>
@@ -764,7 +764,7 @@
               <w:jc w:val="right"/>
             </w:pPr>
             <w:r>
-              <w:t xml:space="preserve">9261</w:t>
+              <w:t xml:space="preserve">2501</w:t>
             </w:r>
           </w:p>
         </w:tc>
@@ -778,43 +778,43 @@
               <w:jc w:val="left"/>
             </w:pPr>
             <w:r>
-              <w:t xml:space="preserve">Before 2020</w:t>
-            </w:r>
-          </w:p>
-        </w:tc>
-        <w:tc>
-          <w:tcPr/>
-          <w:p>
-            <w:pPr>
-              <w:pStyle w:val="Compact"/>
-              <w:jc w:val="right"/>
-            </w:pPr>
-            <w:r>
-              <w:t xml:space="preserve">2607</w:t>
-            </w:r>
-          </w:p>
-        </w:tc>
-        <w:tc>
-          <w:tcPr/>
-          <w:p>
-            <w:pPr>
-              <w:pStyle w:val="Compact"/>
-              <w:jc w:val="right"/>
-            </w:pPr>
-            <w:r>
-              <w:t xml:space="preserve">29.7461</w:t>
-            </w:r>
-          </w:p>
-        </w:tc>
-        <w:tc>
-          <w:tcPr/>
-          <w:p>
-            <w:pPr>
-              <w:pStyle w:val="Compact"/>
-              <w:jc w:val="right"/>
-            </w:pPr>
-            <w:r>
-              <w:t xml:space="preserve">210.659</w:t>
+              <w:t xml:space="preserve">Before 2021</w:t>
+            </w:r>
+          </w:p>
+        </w:tc>
+        <w:tc>
+          <w:tcPr/>
+          <w:p>
+            <w:pPr>
+              <w:pStyle w:val="Compact"/>
+              <w:jc w:val="right"/>
+            </w:pPr>
+            <w:r>
+              <w:t xml:space="preserve">2861</w:t>
+            </w:r>
+          </w:p>
+        </w:tc>
+        <w:tc>
+          <w:tcPr/>
+          <w:p>
+            <w:pPr>
+              <w:pStyle w:val="Compact"/>
+              <w:jc w:val="right"/>
+            </w:pPr>
+            <w:r>
+              <w:t xml:space="preserve">31.1779</w:t>
+            </w:r>
+          </w:p>
+        </w:tc>
+        <w:tc>
+          <w:tcPr/>
+          <w:p>
+            <w:pPr>
+              <w:pStyle w:val="Compact"/>
+              <w:jc w:val="right"/>
+            </w:pPr>
+            <w:r>
+              <w:t xml:space="preserve">265.348</w:t>
             </w:r>
           </w:p>
         </w:tc>
@@ -874,7 +874,7 @@
               <w:jc w:val="right"/>
             </w:pPr>
             <w:r>
-              <w:t xml:space="preserve">5681</w:t>
+              <w:t xml:space="preserve">9261</w:t>
             </w:r>
           </w:p>
         </w:tc>
@@ -1030,43 +1030,43 @@
               <w:jc w:val="left"/>
             </w:pPr>
             <w:r>
-              <w:t xml:space="preserve">2020 and After</w:t>
-            </w:r>
-          </w:p>
-        </w:tc>
-        <w:tc>
-          <w:tcPr/>
-          <w:p>
-            <w:pPr>
-              <w:pStyle w:val="Compact"/>
-              <w:jc w:val="right"/>
-            </w:pPr>
-            <w:r>
-              <w:t xml:space="preserve">4472</w:t>
-            </w:r>
-          </w:p>
-        </w:tc>
-        <w:tc>
-          <w:tcPr/>
-          <w:p>
-            <w:pPr>
-              <w:pStyle w:val="Compact"/>
-              <w:jc w:val="right"/>
-            </w:pPr>
-            <w:r>
-              <w:t xml:space="preserve">2.92688</w:t>
-            </w:r>
-          </w:p>
-        </w:tc>
-        <w:tc>
-          <w:tcPr/>
-          <w:p>
-            <w:pPr>
-              <w:pStyle w:val="Compact"/>
-              <w:jc w:val="right"/>
-            </w:pPr>
-            <w:r>
-              <w:t xml:space="preserve">27.3021</w:t>
+              <w:t xml:space="preserve">2021 and After</w:t>
+            </w:r>
+          </w:p>
+        </w:tc>
+        <w:tc>
+          <w:tcPr/>
+          <w:p>
+            <w:pPr>
+              <w:pStyle w:val="Compact"/>
+              <w:jc w:val="right"/>
+            </w:pPr>
+            <w:r>
+              <w:t xml:space="preserve">3552</w:t>
+            </w:r>
+          </w:p>
+        </w:tc>
+        <w:tc>
+          <w:tcPr/>
+          <w:p>
+            <w:pPr>
+              <w:pStyle w:val="Compact"/>
+              <w:jc w:val="right"/>
+            </w:pPr>
+            <w:r>
+              <w:t xml:space="preserve">2.92877</w:t>
+            </w:r>
+          </w:p>
+        </w:tc>
+        <w:tc>
+          <w:tcPr/>
+          <w:p>
+            <w:pPr>
+              <w:pStyle w:val="Compact"/>
+              <w:jc w:val="right"/>
+            </w:pPr>
+            <w:r>
+              <w:t xml:space="preserve">28.8645</w:t>
             </w:r>
           </w:p>
         </w:tc>
@@ -1140,43 +1140,43 @@
               <w:jc w:val="left"/>
             </w:pPr>
             <w:r>
-              <w:t xml:space="preserve">Before 2020</w:t>
-            </w:r>
-          </w:p>
-        </w:tc>
-        <w:tc>
-          <w:tcPr/>
-          <w:p>
-            <w:pPr>
-              <w:pStyle w:val="Compact"/>
-              <w:jc w:val="right"/>
-            </w:pPr>
-            <w:r>
-              <w:t xml:space="preserve">6206</w:t>
-            </w:r>
-          </w:p>
-        </w:tc>
-        <w:tc>
-          <w:tcPr/>
-          <w:p>
-            <w:pPr>
-              <w:pStyle w:val="Compact"/>
-              <w:jc w:val="right"/>
-            </w:pPr>
-            <w:r>
-              <w:t xml:space="preserve">4.71221</w:t>
-            </w:r>
-          </w:p>
-        </w:tc>
-        <w:tc>
-          <w:tcPr/>
-          <w:p>
-            <w:pPr>
-              <w:pStyle w:val="Compact"/>
-              <w:jc w:val="right"/>
-            </w:pPr>
-            <w:r>
-              <w:t xml:space="preserve">57.1161</w:t>
+              <w:t xml:space="preserve">Before 2021</w:t>
+            </w:r>
+          </w:p>
+        </w:tc>
+        <w:tc>
+          <w:tcPr/>
+          <w:p>
+            <w:pPr>
+              <w:pStyle w:val="Compact"/>
+              <w:jc w:val="right"/>
+            </w:pPr>
+            <w:r>
+              <w:t xml:space="preserve">7126</w:t>
+            </w:r>
+          </w:p>
+        </w:tc>
+        <w:tc>
+          <w:tcPr/>
+          <w:p>
+            <w:pPr>
+              <w:pStyle w:val="Compact"/>
+              <w:jc w:val="right"/>
+            </w:pPr>
+            <w:r>
+              <w:t xml:space="preserve">4.48077</w:t>
+            </w:r>
+          </w:p>
+        </w:tc>
+        <w:tc>
+          <w:tcPr/>
+          <w:p>
+            <w:pPr>
+              <w:pStyle w:val="Compact"/>
+              <w:jc w:val="right"/>
+            </w:pPr>
+            <w:r>
+              <w:t xml:space="preserve">53.7949</w:t>
             </w:r>
           </w:p>
         </w:tc>
@@ -1200,7 +1200,7 @@
               <w:jc w:val="right"/>
             </w:pPr>
             <w:r>
-              <w:t xml:space="preserve">1</w:t>
+              <w:t xml:space="preserve">0</w:t>
             </w:r>
           </w:p>
         </w:tc>
@@ -1257,13 +1257,13 @@
         <w:pStyle w:val="FirstParagraph"/>
       </w:pPr>
       <w:r>
-        <w:t xml:space="preserve">T-Statistic: 2.8723</w:t>
+        <w:t xml:space="preserve">T-Statistic: 3.9419</w:t>
       </w:r>
       <w:r>
         <w:t xml:space="preserve"> </w:t>
       </w:r>
       <w:r>
-        <w:t xml:space="preserve">P-Value: 0.0041</w:t>
+        <w:t xml:space="preserve">P-Value: 0.0001</w:t>
       </w:r>
       <w:r>
         <w:t xml:space="preserve"> </w:t>
@@ -1287,19 +1287,19 @@
         <w:pStyle w:val="FirstParagraph"/>
       </w:pPr>
       <w:r>
-        <w:t xml:space="preserve">T-Statistic: 2.1457</w:t>
+        <w:t xml:space="preserve">T-Statistic: 1.9390</w:t>
       </w:r>
       <w:r>
         <w:t xml:space="preserve"> </w:t>
       </w:r>
       <w:r>
-        <w:t xml:space="preserve">P-Value: 0.0319</w:t>
+        <w:t xml:space="preserve">P-Value: 0.0525</w:t>
       </w:r>
       <w:r>
         <w:t xml:space="preserve"> </w:t>
       </w:r>
       <w:r>
-        <w:t xml:space="preserve">The difference in response time for recent spills is statistically significant.</w:t>
+        <w:t xml:space="preserve">The difference in response time for recent spills is not statistically significant.</w:t>
       </w:r>
     </w:p>
     <w:bookmarkEnd w:id="25"/>

</xml_diff>